<commit_message>
chore: remove 2DPCA dataset and delete irrelevant files
- remove 2DPCA dataset and update professional english file
- delete some irrelevant files
- exclude files exceeding GitHub size limit via .gitignore
</commit_message>
<xml_diff>
--- a/专业课/专业英语/王锦政2024270223-展讲报告.docx
+++ b/专业课/专业英语/王锦政2024270223-展讲报告.docx
@@ -8,7 +8,7 @@
         <w:spacing w:beforeLines="25" w:before="78" w:afterLines="25" w:after="78" w:line="288" w:lineRule="auto"/>
         <w:ind w:firstLine="420"/>
         <w:rPr>
-          <w:rFonts w:cs="Times New Roman" w:hint="eastAsia"/>
+          <w:rFonts w:cs="Times New Roman"/>
           <w:sz w:val="21"/>
           <w:szCs w:val="21"/>
         </w:rPr>
@@ -36,7 +36,7 @@
         <w:spacing w:beforeLines="25" w:before="78" w:afterLines="25" w:after="78" w:line="288" w:lineRule="auto"/>
         <w:ind w:firstLine="420"/>
         <w:rPr>
-          <w:rFonts w:cs="Times New Roman" w:hint="eastAsia"/>
+          <w:rFonts w:cs="Times New Roman"/>
           <w:sz w:val="21"/>
           <w:szCs w:val="21"/>
         </w:rPr>
@@ -60,7 +60,25 @@
           <w:sz w:val="21"/>
           <w:szCs w:val="21"/>
         </w:rPr>
-        <w:t>摘要：这篇论文针对现有三维网格风格化方法中表达力和表真度难以兼顾的难题，构建了基于法线驱动的风格化技术体系。论文提出了一种全新的可微</w:t>
+        <w:t>摘要：这篇论文针对现有三维网格风格化方法中表达力和表</w:t>
+      </w:r>
+      <w:proofErr w:type="gramStart"/>
+      <w:r>
+        <w:rPr>
+          <w:rFonts w:cs="Times New Roman"/>
+          <w:sz w:val="21"/>
+          <w:szCs w:val="21"/>
+        </w:rPr>
+        <w:t>真度难以</w:t>
+      </w:r>
+      <w:proofErr w:type="gramEnd"/>
+      <w:r>
+        <w:rPr>
+          <w:rFonts w:cs="Times New Roman"/>
+          <w:sz w:val="21"/>
+          <w:szCs w:val="21"/>
+        </w:rPr>
+        <w:t>兼顾的难题，构建了基于法线驱动的风格化技术体系。论文提出了一种全新的可微</w:t>
       </w:r>
       <w:proofErr w:type="spellStart"/>
       <w:r>
@@ -78,7 +96,25 @@
           <w:sz w:val="21"/>
           <w:szCs w:val="21"/>
         </w:rPr>
-        <w:t>层，将传统的几何优化算法转化为神经网络可用的模块；依托文本到图像扩散模型的语义理解能力，实现了仅通过文本提示即可对三维网格进行高质量、保持身份特征的几何形变。形成了一套从法线优化到顶点更新的端到端风格化方案，有效提升了三维内容生成的灵活性与可控性，发表在</w:t>
+        <w:t>层，将传统的几何优化算法转化为神经网络可用的模块；依托文本到图像扩散模型的语义理解能力，实现了仅通过文本提示即可对三维网格进行高质量、保持身份特征的几何形变。形成了一套从法线优化到顶点更新的端到</w:t>
+      </w:r>
+      <w:proofErr w:type="gramStart"/>
+      <w:r>
+        <w:rPr>
+          <w:rFonts w:cs="Times New Roman"/>
+          <w:sz w:val="21"/>
+          <w:szCs w:val="21"/>
+        </w:rPr>
+        <w:t>端风格</w:t>
+      </w:r>
+      <w:proofErr w:type="gramEnd"/>
+      <w:r>
+        <w:rPr>
+          <w:rFonts w:cs="Times New Roman"/>
+          <w:sz w:val="21"/>
+          <w:szCs w:val="21"/>
+        </w:rPr>
+        <w:t>化方案，有效提升了三维内容生成的灵活性与可控性，发表在</w:t>
       </w:r>
       <w:r>
         <w:rPr>
@@ -104,7 +140,7 @@
         <w:spacing w:beforeLines="25" w:before="78" w:afterLines="25" w:after="78" w:line="288" w:lineRule="auto"/>
         <w:ind w:firstLine="420"/>
         <w:rPr>
-          <w:rFonts w:cs="Times New Roman" w:hint="eastAsia"/>
+          <w:rFonts w:cs="Times New Roman"/>
           <w:sz w:val="21"/>
           <w:szCs w:val="21"/>
         </w:rPr>
@@ -1244,7 +1280,7 @@
               <w:tab w:val="right" w:leader="dot" w:pos="8296"/>
             </w:tabs>
             <w:spacing w:before="25" w:after="25" w:line="288" w:lineRule="auto"/>
-            <w:ind w:left="960" w:firstLine="420"/>
+            <w:ind w:left="960" w:firstLine="480"/>
             <w:rPr>
               <w:rFonts w:eastAsiaTheme="minorEastAsia" w:cs="Times New Roman"/>
               <w:noProof/>
@@ -1371,7 +1407,7 @@
               <w:tab w:val="right" w:leader="dot" w:pos="8296"/>
             </w:tabs>
             <w:spacing w:before="25" w:after="25" w:line="288" w:lineRule="auto"/>
-            <w:ind w:left="960" w:firstLine="420"/>
+            <w:ind w:left="960" w:firstLine="480"/>
             <w:rPr>
               <w:rFonts w:eastAsiaTheme="minorEastAsia" w:cs="Times New Roman"/>
               <w:noProof/>
@@ -2178,9 +2214,6 @@
         <w:snapToGrid/>
         <w:spacing w:before="25" w:after="25" w:line="288" w:lineRule="auto"/>
         <w:ind w:firstLineChars="0" w:firstLine="0"/>
-        <w:rPr>
-          <w:rFonts w:hint="eastAsia"/>
-        </w:rPr>
       </w:pPr>
       <w:r>
         <w:br w:type="page"/>
@@ -2215,7 +2248,6 @@
         <w:spacing w:beforeLines="25" w:before="78" w:afterLines="25" w:after="78" w:line="288" w:lineRule="auto"/>
         <w:ind w:left="960" w:hanging="480"/>
         <w:rPr>
-          <w:rFonts w:hint="eastAsia"/>
           <w:noProof/>
         </w:rPr>
       </w:pPr>
@@ -2343,9 +2375,8 @@
           <w:tab w:val="right" w:leader="dot" w:pos="8296"/>
         </w:tabs>
         <w:spacing w:beforeLines="25" w:before="78" w:afterLines="25" w:after="78" w:line="288" w:lineRule="auto"/>
-        <w:ind w:left="900" w:hanging="420"/>
-        <w:rPr>
-          <w:rFonts w:hint="eastAsia"/>
+        <w:ind w:left="960" w:hanging="480"/>
+        <w:rPr>
           <w:noProof/>
           <w:sz w:val="21"/>
           <w:szCs w:val="21"/>
@@ -2478,9 +2509,8 @@
           <w:tab w:val="right" w:leader="dot" w:pos="8296"/>
         </w:tabs>
         <w:spacing w:beforeLines="25" w:before="78" w:afterLines="25" w:after="78" w:line="288" w:lineRule="auto"/>
-        <w:ind w:left="900" w:hanging="420"/>
-        <w:rPr>
-          <w:rFonts w:hint="eastAsia"/>
+        <w:ind w:left="960" w:hanging="480"/>
+        <w:rPr>
           <w:noProof/>
           <w:sz w:val="21"/>
           <w:szCs w:val="21"/>
@@ -2633,9 +2663,8 @@
           <w:tab w:val="right" w:leader="dot" w:pos="8296"/>
         </w:tabs>
         <w:spacing w:beforeLines="25" w:before="78" w:afterLines="25" w:after="78" w:line="288" w:lineRule="auto"/>
-        <w:ind w:left="900" w:hanging="420"/>
-        <w:rPr>
-          <w:rFonts w:hint="eastAsia"/>
+        <w:ind w:left="960" w:hanging="480"/>
+        <w:rPr>
           <w:noProof/>
           <w:sz w:val="21"/>
           <w:szCs w:val="21"/>
@@ -2786,9 +2815,6 @@
       <w:pPr>
         <w:spacing w:before="25" w:after="25" w:line="288" w:lineRule="auto"/>
         <w:ind w:firstLineChars="0" w:firstLine="0"/>
-        <w:rPr>
-          <w:rFonts w:hint="eastAsia"/>
-        </w:rPr>
       </w:pPr>
     </w:p>
     <w:p>
@@ -3050,7 +3076,23 @@
           <w:sz w:val="21"/>
           <w:szCs w:val="21"/>
         </w:rPr>
-        <w:t>）的表面级微小变化，无法进行显著的几何结构调整。</w:t>
+        <w:t>）的</w:t>
+      </w:r>
+      <w:proofErr w:type="gramStart"/>
+      <w:r>
+        <w:rPr>
+          <w:sz w:val="21"/>
+          <w:szCs w:val="21"/>
+        </w:rPr>
+        <w:t>表面级</w:t>
+      </w:r>
+      <w:proofErr w:type="gramEnd"/>
+      <w:r>
+        <w:rPr>
+          <w:sz w:val="21"/>
+          <w:szCs w:val="21"/>
+        </w:rPr>
+        <w:t>微小变化，无法进行显著的几何结构调整。</w:t>
       </w:r>
     </w:p>
     <w:p>
@@ -3968,7 +4010,23 @@
           <w:sz w:val="21"/>
           <w:szCs w:val="21"/>
         </w:rPr>
-        <w:t>整个过程由预训练的文本到图像模型（</w:t>
+        <w:t>整个过程</w:t>
+      </w:r>
+      <w:proofErr w:type="gramStart"/>
+      <w:r>
+        <w:rPr>
+          <w:sz w:val="21"/>
+          <w:szCs w:val="21"/>
+        </w:rPr>
+        <w:t>由预训练</w:t>
+      </w:r>
+      <w:proofErr w:type="gramEnd"/>
+      <w:r>
+        <w:rPr>
+          <w:sz w:val="21"/>
+          <w:szCs w:val="21"/>
+        </w:rPr>
+        <w:t>的文本到图像模型（</w:t>
       </w:r>
       <w:r>
         <w:rPr>
@@ -4903,14 +4961,31 @@
           <w:sz w:val="21"/>
           <w:szCs w:val="21"/>
         </w:rPr>
-        <w:t>表达力和表真度</w:t>
-      </w:r>
-      <w:r>
-        <w:rPr>
-          <w:sz w:val="21"/>
-          <w:szCs w:val="21"/>
-        </w:rPr>
-        <w:t>之间的矛盾。</w:t>
+        <w:t>表达力和</w:t>
+      </w:r>
+      <w:proofErr w:type="gramStart"/>
+      <w:r>
+        <w:rPr>
+          <w:rFonts w:hint="eastAsia"/>
+          <w:sz w:val="21"/>
+          <w:szCs w:val="21"/>
+        </w:rPr>
+        <w:t>表真度</w:t>
+      </w:r>
+      <w:r>
+        <w:rPr>
+          <w:sz w:val="21"/>
+          <w:szCs w:val="21"/>
+        </w:rPr>
+        <w:t>之间</w:t>
+      </w:r>
+      <w:proofErr w:type="gramEnd"/>
+      <w:r>
+        <w:rPr>
+          <w:sz w:val="21"/>
+          <w:szCs w:val="21"/>
+        </w:rPr>
+        <w:t>的矛盾。</w:t>
       </w:r>
     </w:p>
     <w:p>
@@ -5338,7 +5413,6 @@
         <w:spacing w:before="25" w:after="25" w:line="288" w:lineRule="auto"/>
         <w:ind w:left="420" w:firstLineChars="0" w:firstLine="0"/>
         <w:rPr>
-          <w:rFonts w:hint="eastAsia"/>
           <w:sz w:val="21"/>
           <w:szCs w:val="21"/>
         </w:rPr>
@@ -5405,17 +5479,17 @@
         <w:spacing w:before="25" w:after="25" w:line="288" w:lineRule="auto"/>
         <w:ind w:firstLineChars="0"/>
         <w:rPr>
-          <w:rFonts w:cs="Times New Roman" w:hint="eastAsia"/>
-          <w:sz w:val="21"/>
-          <w:szCs w:val="21"/>
-        </w:rPr>
-      </w:pPr>
-      <w:r>
-        <w:rPr>
           <w:rFonts w:cs="Times New Roman"/>
           <w:sz w:val="21"/>
           <w:szCs w:val="21"/>
         </w:rPr>
+      </w:pPr>
+      <w:r>
+        <w:rPr>
+          <w:rFonts w:cs="Times New Roman"/>
+          <w:sz w:val="21"/>
+          <w:szCs w:val="21"/>
+        </w:rPr>
         <w:t xml:space="preserve"> </w:t>
       </w:r>
       <w:r>
@@ -5440,15 +5514,7 @@
           <w:sz w:val="21"/>
           <w:szCs w:val="21"/>
         </w:rPr>
-        <w:t>：</w:t>
-      </w:r>
-      <w:r>
-        <w:rPr>
-          <w:rFonts w:cs="Times New Roman"/>
-          <w:sz w:val="21"/>
-          <w:szCs w:val="21"/>
-        </w:rPr>
-        <w:t>这个公式的目标是为网格上的每一个顶点</w:t>
+        <w:t>：这个公式的目标是为网格上的每一个顶点</w:t>
       </w:r>
       <w:r>
         <w:rPr>
@@ -5875,7 +5941,7 @@
         <w:spacing w:before="25" w:after="25" w:line="288" w:lineRule="auto"/>
         <w:ind w:firstLineChars="0"/>
         <w:rPr>
-          <w:rFonts w:cs="Times New Roman" w:hint="eastAsia"/>
+          <w:rFonts w:cs="Times New Roman"/>
           <w:sz w:val="21"/>
           <w:szCs w:val="21"/>
         </w:rPr>
@@ -6065,7 +6131,6 @@
         <w:ind w:firstLineChars="0"/>
         <w:rPr>
           <w:rStyle w:val="ng-star-inserted1"/>
-          <w:rFonts w:hint="eastAsia"/>
           <w:sz w:val="21"/>
           <w:szCs w:val="21"/>
         </w:rPr>
@@ -6199,7 +6264,7 @@
           <w:sz w:val="21"/>
           <w:szCs w:val="21"/>
         </w:rPr>
-        <w:t>，</w:t>
+        <w:t>，表示我们要找到一套全新的顶点坐标</w:t>
       </w:r>
       <w:r>
         <w:rPr>
@@ -6209,7 +6274,7 @@
           <w:sz w:val="21"/>
           <w:szCs w:val="21"/>
         </w:rPr>
-        <w:t>表示我们要找到一套全新的顶点坐标</w:t>
+        <w:t>Ṽ (V-tilde)</w:t>
       </w:r>
       <w:r>
         <w:rPr>
@@ -6219,17 +6284,26 @@
           <w:sz w:val="21"/>
           <w:szCs w:val="21"/>
         </w:rPr>
-        <w:t>Ṽ (V-tilde)</w:t>
-      </w:r>
-      <w:r>
-        <w:rPr>
-          <w:rStyle w:val="ng-star-inserted1"/>
+        <w:t>，使得等号右边的表达式的值达到最小。</w:t>
+      </w:r>
+      <w:r>
+        <w:rPr>
           <w:rFonts w:ascii="Times New Roman" w:hAnsi="Times New Roman" w:cs="Times New Roman"/>
           <w:color w:val="1A1C1E"/>
           <w:sz w:val="21"/>
           <w:szCs w:val="21"/>
         </w:rPr>
-        <w:t>，使得等号右边的表达式的值达到最小。</w:t>
+        <w:t>∑ k</w:t>
+      </w:r>
+      <w:proofErr w:type="gramStart"/>
+      <w:r>
+        <w:rPr>
+          <w:rFonts w:ascii="Cambria Math" w:hAnsi="Cambria Math" w:cs="Cambria Math"/>
+          <w:color w:val="1A1C1E"/>
+          <w:sz w:val="21"/>
+          <w:szCs w:val="21"/>
+        </w:rPr>
+        <w:t>∈</w:t>
       </w:r>
       <w:r>
         <w:rPr>
@@ -6238,7 +6312,39 @@
           <w:sz w:val="21"/>
           <w:szCs w:val="21"/>
         </w:rPr>
-        <w:t>∑ k</w:t>
+        <w:t>{</w:t>
+      </w:r>
+      <w:proofErr w:type="gramEnd"/>
+      <w:r>
+        <w:rPr>
+          <w:rFonts w:ascii="Times New Roman" w:hAnsi="Times New Roman" w:cs="Times New Roman"/>
+          <w:color w:val="1A1C1E"/>
+          <w:sz w:val="21"/>
+          <w:szCs w:val="21"/>
+        </w:rPr>
+        <w:t>1...|V|} ∑ (</w:t>
+      </w:r>
+      <w:proofErr w:type="spellStart"/>
+      <w:proofErr w:type="gramStart"/>
+      <w:r>
+        <w:rPr>
+          <w:rFonts w:ascii="Times New Roman" w:hAnsi="Times New Roman" w:cs="Times New Roman"/>
+          <w:color w:val="1A1C1E"/>
+          <w:sz w:val="21"/>
+          <w:szCs w:val="21"/>
+        </w:rPr>
+        <w:t>i,j</w:t>
+      </w:r>
+      <w:proofErr w:type="spellEnd"/>
+      <w:proofErr w:type="gramEnd"/>
+      <w:r>
+        <w:rPr>
+          <w:rFonts w:ascii="Times New Roman" w:hAnsi="Times New Roman" w:cs="Times New Roman"/>
+          <w:color w:val="1A1C1E"/>
+          <w:sz w:val="21"/>
+          <w:szCs w:val="21"/>
+        </w:rPr>
+        <w:t>)</w:t>
       </w:r>
       <w:r>
         <w:rPr>
@@ -6249,6 +6355,7 @@
         </w:rPr>
         <w:t>∈</w:t>
       </w:r>
+      <w:proofErr w:type="spellStart"/>
       <w:r>
         <w:rPr>
           <w:rFonts w:ascii="Times New Roman" w:hAnsi="Times New Roman" w:cs="Times New Roman"/>
@@ -6256,9 +6363,9 @@
           <w:sz w:val="21"/>
           <w:szCs w:val="21"/>
         </w:rPr>
-        <w:t>{1...|V|} ∑ (</w:t>
-      </w:r>
-      <w:proofErr w:type="spellStart"/>
+        <w:t>Nk</w:t>
+      </w:r>
+      <w:proofErr w:type="spellEnd"/>
       <w:r>
         <w:rPr>
           <w:rFonts w:ascii="Times New Roman" w:hAnsi="Times New Roman" w:cs="Times New Roman"/>
@@ -6266,9 +6373,8 @@
           <w:sz w:val="21"/>
           <w:szCs w:val="21"/>
         </w:rPr>
-        <w:t>i,j</w:t>
-      </w:r>
-      <w:proofErr w:type="spellEnd"/>
+        <w:t xml:space="preserve">: </w:t>
+      </w:r>
       <w:r>
         <w:rPr>
           <w:rFonts w:ascii="Times New Roman" w:hAnsi="Times New Roman" w:cs="Times New Roman"/>
@@ -6276,18 +6382,8 @@
           <w:sz w:val="21"/>
           <w:szCs w:val="21"/>
         </w:rPr>
-        <w:t>)</w:t>
-      </w:r>
-      <w:r>
-        <w:rPr>
-          <w:rFonts w:ascii="Cambria Math" w:hAnsi="Cambria Math" w:cs="Cambria Math"/>
-          <w:color w:val="1A1C1E"/>
-          <w:sz w:val="21"/>
-          <w:szCs w:val="21"/>
-        </w:rPr>
-        <w:t>∈</w:t>
-      </w:r>
-      <w:proofErr w:type="spellStart"/>
+        <w:t>一个双重求和，遍历了网格上的每一个顶点</w:t>
+      </w:r>
       <w:r>
         <w:rPr>
           <w:rFonts w:ascii="Times New Roman" w:hAnsi="Times New Roman" w:cs="Times New Roman"/>
@@ -6295,9 +6391,8 @@
           <w:sz w:val="21"/>
           <w:szCs w:val="21"/>
         </w:rPr>
-        <w:t>Nk</w:t>
-      </w:r>
-      <w:proofErr w:type="spellEnd"/>
+        <w:t>k</w:t>
+      </w:r>
       <w:r>
         <w:rPr>
           <w:rFonts w:ascii="Times New Roman" w:hAnsi="Times New Roman" w:cs="Times New Roman"/>
@@ -6305,7 +6400,7 @@
           <w:sz w:val="21"/>
           <w:szCs w:val="21"/>
         </w:rPr>
-        <w:t xml:space="preserve">: </w:t>
+        <w:t>以及其邻域内的每一条边</w:t>
       </w:r>
       <w:r>
         <w:rPr>
@@ -6314,8 +6409,10 @@
           <w:sz w:val="21"/>
           <w:szCs w:val="21"/>
         </w:rPr>
-        <w:t>一个双重求和，遍历了网格上的每一个顶点</w:t>
-      </w:r>
+        <w:t>(</w:t>
+      </w:r>
+      <w:proofErr w:type="spellStart"/>
+      <w:proofErr w:type="gramStart"/>
       <w:r>
         <w:rPr>
           <w:rFonts w:ascii="Times New Roman" w:hAnsi="Times New Roman" w:cs="Times New Roman"/>
@@ -6323,37 +6420,10 @@
           <w:sz w:val="21"/>
           <w:szCs w:val="21"/>
         </w:rPr>
-        <w:t>k</w:t>
-      </w:r>
-      <w:r>
-        <w:rPr>
-          <w:rFonts w:ascii="Times New Roman" w:hAnsi="Times New Roman" w:cs="Times New Roman"/>
-          <w:color w:val="1A1C1E"/>
-          <w:sz w:val="21"/>
-          <w:szCs w:val="21"/>
-        </w:rPr>
-        <w:t>以及其邻域内的每一条边</w:t>
-      </w:r>
-      <w:r>
-        <w:rPr>
-          <w:rFonts w:ascii="Times New Roman" w:hAnsi="Times New Roman" w:cs="Times New Roman"/>
-          <w:color w:val="1A1C1E"/>
-          <w:sz w:val="21"/>
-          <w:szCs w:val="21"/>
-        </w:rPr>
-        <w:t>(</w:t>
-      </w:r>
-      <w:proofErr w:type="spellStart"/>
-      <w:r>
-        <w:rPr>
-          <w:rFonts w:ascii="Times New Roman" w:hAnsi="Times New Roman" w:cs="Times New Roman"/>
-          <w:color w:val="1A1C1E"/>
-          <w:sz w:val="21"/>
-          <w:szCs w:val="21"/>
-        </w:rPr>
         <w:t>i,j</w:t>
       </w:r>
       <w:proofErr w:type="spellEnd"/>
+      <w:proofErr w:type="gramEnd"/>
       <w:r>
         <w:rPr>
           <w:rFonts w:ascii="Times New Roman" w:hAnsi="Times New Roman" w:cs="Times New Roman"/>
@@ -6382,7 +6452,7 @@
         </w:numPr>
         <w:spacing w:before="25" w:beforeAutospacing="0" w:after="25" w:afterAutospacing="0" w:line="288" w:lineRule="auto"/>
         <w:rPr>
-          <w:rFonts w:ascii="Times New Roman" w:hAnsi="Times New Roman" w:cs="Times New Roman" w:hint="eastAsia"/>
+          <w:rFonts w:ascii="Times New Roman" w:hAnsi="Times New Roman" w:cs="Times New Roman"/>
           <w:color w:val="1A1C1E"/>
           <w:sz w:val="21"/>
           <w:szCs w:val="21"/>
@@ -6506,16 +6576,7 @@
           <w:sz w:val="21"/>
           <w:szCs w:val="21"/>
         </w:rPr>
-        <w:t>：</w:t>
-      </w:r>
-      <w:r>
-        <w:rPr>
-          <w:rFonts w:ascii="Times New Roman" w:hAnsi="Times New Roman" w:cs="Times New Roman"/>
-          <w:color w:val="1A1C1E"/>
-          <w:sz w:val="21"/>
-          <w:szCs w:val="21"/>
-        </w:rPr>
-        <w:t>这一项要求，我们最终找到的新顶点位置所构成的实际边</w:t>
+        <w:t>：这一项要求，我们最终找到的新顶点位置所构成的实际边</w:t>
       </w:r>
       <w:r>
         <w:rPr>
@@ -6626,6 +6687,12 @@
       </w:r>
     </w:p>
     <w:sectPr>
+      <w:headerReference w:type="even" r:id="rId13"/>
+      <w:headerReference w:type="default" r:id="rId14"/>
+      <w:footerReference w:type="even" r:id="rId15"/>
+      <w:footerReference w:type="default" r:id="rId16"/>
+      <w:headerReference w:type="first" r:id="rId17"/>
+      <w:footerReference w:type="first" r:id="rId18"/>
       <w:pgSz w:w="11906" w:h="16838"/>
       <w:pgMar w:top="1440" w:right="1800" w:bottom="1440" w:left="1800" w:header="851" w:footer="992" w:gutter="0"/>
       <w:cols w:space="425"/>
@@ -6660,6 +6727,39 @@
 </w:endnotes>
 </file>
 
+<file path=word/footer1.xml><?xml version="1.0" encoding="utf-8"?>
+<w:ftr xmlns:wpc="http://schemas.microsoft.com/office/word/2010/wordprocessingCanvas" xmlns:cx="http://schemas.microsoft.com/office/drawing/2014/chartex" xmlns:cx1="http://schemas.microsoft.com/office/drawing/2015/9/8/chartex" xmlns:cx2="http://schemas.microsoft.com/office/drawing/2015/10/21/chartex" xmlns:cx3="http://schemas.microsoft.com/office/drawing/2016/5/9/chartex" xmlns:cx4="http://schemas.microsoft.com/office/drawing/2016/5/10/chartex" xmlns:cx5="http://schemas.microsoft.com/office/drawing/2016/5/11/chartex" xmlns:cx6="http://schemas.microsoft.com/office/drawing/2016/5/12/chartex" xmlns:cx7="http://schemas.microsoft.com/office/drawing/2016/5/13/chartex" xmlns:cx8="http://schemas.microsoft.com/office/drawing/2016/5/14/chartex" xmlns:mc="http://schemas.openxmlformats.org/markup-compatibility/2006" xmlns:aink="http://schemas.microsoft.com/office/drawing/2016/ink" xmlns:am3d="http://schemas.microsoft.com/office/drawing/2017/model3d" xmlns:o="urn:schemas-microsoft-com:office:office" xmlns:oel="http://schemas.microsoft.com/office/2019/extlst" xmlns:r="http://schemas.openxmlformats.org/officeDocument/2006/relationships" xmlns:m="http://schemas.openxmlformats.org/officeDocument/2006/math" xmlns:v="urn:schemas-microsoft-com:vml" xmlns:wp14="http://schemas.microsoft.com/office/word/2010/wordprocessingDrawing" xmlns:wp="http://schemas.openxmlformats.org/drawingml/2006/wordprocessingDrawing" xmlns:w10="urn:schemas-microsoft-com:office:word" xmlns:w="http://schemas.openxmlformats.org/wordprocessingml/2006/main" xmlns:w14="http://schemas.microsoft.com/office/word/2010/wordml" xmlns:w15="http://schemas.microsoft.com/office/word/2012/wordml" xmlns:w16cex="http://schemas.microsoft.com/office/word/2018/wordml/cex" xmlns:w16cid="http://schemas.microsoft.com/office/word/2016/wordml/cid" xmlns:w16="http://schemas.microsoft.com/office/word/2018/wordml" xmlns:w16du="http://schemas.microsoft.com/office/word/2023/wordml/word16du" xmlns:w16sdtdh="http://schemas.microsoft.com/office/word/2020/wordml/sdtdatahash" xmlns:w16sdtfl="http://schemas.microsoft.com/office/word/2024/wordml/sdtformatlock" xmlns:w16se="http://schemas.microsoft.com/office/word/2015/wordml/symex" xmlns:wpg="http://schemas.microsoft.com/office/word/2010/wordprocessingGroup" xmlns:wpi="http://schemas.microsoft.com/office/word/2010/wordprocessingInk" xmlns:wne="http://schemas.microsoft.com/office/word/2006/wordml" xmlns:wps="http://schemas.microsoft.com/office/word/2010/wordprocessingShape" mc:Ignorable="w14 w15 w16se w16cid w16 w16cex w16sdtdh w16sdtfl w16du wp14">
+  <w:p>
+    <w:pPr>
+      <w:pStyle w:val="af4"/>
+      <w:ind w:firstLine="360"/>
+    </w:pPr>
+  </w:p>
+</w:ftr>
+</file>
+
+<file path=word/footer2.xml><?xml version="1.0" encoding="utf-8"?>
+<w:ftr xmlns:wpc="http://schemas.microsoft.com/office/word/2010/wordprocessingCanvas" xmlns:cx="http://schemas.microsoft.com/office/drawing/2014/chartex" xmlns:cx1="http://schemas.microsoft.com/office/drawing/2015/9/8/chartex" xmlns:cx2="http://schemas.microsoft.com/office/drawing/2015/10/21/chartex" xmlns:cx3="http://schemas.microsoft.com/office/drawing/2016/5/9/chartex" xmlns:cx4="http://schemas.microsoft.com/office/drawing/2016/5/10/chartex" xmlns:cx5="http://schemas.microsoft.com/office/drawing/2016/5/11/chartex" xmlns:cx6="http://schemas.microsoft.com/office/drawing/2016/5/12/chartex" xmlns:cx7="http://schemas.microsoft.com/office/drawing/2016/5/13/chartex" xmlns:cx8="http://schemas.microsoft.com/office/drawing/2016/5/14/chartex" xmlns:mc="http://schemas.openxmlformats.org/markup-compatibility/2006" xmlns:aink="http://schemas.microsoft.com/office/drawing/2016/ink" xmlns:am3d="http://schemas.microsoft.com/office/drawing/2017/model3d" xmlns:o="urn:schemas-microsoft-com:office:office" xmlns:oel="http://schemas.microsoft.com/office/2019/extlst" xmlns:r="http://schemas.openxmlformats.org/officeDocument/2006/relationships" xmlns:m="http://schemas.openxmlformats.org/officeDocument/2006/math" xmlns:v="urn:schemas-microsoft-com:vml" xmlns:wp14="http://schemas.microsoft.com/office/word/2010/wordprocessingDrawing" xmlns:wp="http://schemas.openxmlformats.org/drawingml/2006/wordprocessingDrawing" xmlns:w10="urn:schemas-microsoft-com:office:word" xmlns:w="http://schemas.openxmlformats.org/wordprocessingml/2006/main" xmlns:w14="http://schemas.microsoft.com/office/word/2010/wordml" xmlns:w15="http://schemas.microsoft.com/office/word/2012/wordml" xmlns:w16cex="http://schemas.microsoft.com/office/word/2018/wordml/cex" xmlns:w16cid="http://schemas.microsoft.com/office/word/2016/wordml/cid" xmlns:w16="http://schemas.microsoft.com/office/word/2018/wordml" xmlns:w16du="http://schemas.microsoft.com/office/word/2023/wordml/word16du" xmlns:w16sdtdh="http://schemas.microsoft.com/office/word/2020/wordml/sdtdatahash" xmlns:w16sdtfl="http://schemas.microsoft.com/office/word/2024/wordml/sdtformatlock" xmlns:w16se="http://schemas.microsoft.com/office/word/2015/wordml/symex" xmlns:wpg="http://schemas.microsoft.com/office/word/2010/wordprocessingGroup" xmlns:wpi="http://schemas.microsoft.com/office/word/2010/wordprocessingInk" xmlns:wne="http://schemas.microsoft.com/office/word/2006/wordml" xmlns:wps="http://schemas.microsoft.com/office/word/2010/wordprocessingShape" mc:Ignorable="w14 w15 w16se w16cid w16 w16cex w16sdtdh w16sdtfl w16du wp14">
+  <w:p>
+    <w:pPr>
+      <w:pStyle w:val="af4"/>
+      <w:ind w:firstLine="360"/>
+    </w:pPr>
+  </w:p>
+</w:ftr>
+</file>
+
+<file path=word/footer3.xml><?xml version="1.0" encoding="utf-8"?>
+<w:ftr xmlns:wpc="http://schemas.microsoft.com/office/word/2010/wordprocessingCanvas" xmlns:cx="http://schemas.microsoft.com/office/drawing/2014/chartex" xmlns:cx1="http://schemas.microsoft.com/office/drawing/2015/9/8/chartex" xmlns:cx2="http://schemas.microsoft.com/office/drawing/2015/10/21/chartex" xmlns:cx3="http://schemas.microsoft.com/office/drawing/2016/5/9/chartex" xmlns:cx4="http://schemas.microsoft.com/office/drawing/2016/5/10/chartex" xmlns:cx5="http://schemas.microsoft.com/office/drawing/2016/5/11/chartex" xmlns:cx6="http://schemas.microsoft.com/office/drawing/2016/5/12/chartex" xmlns:cx7="http://schemas.microsoft.com/office/drawing/2016/5/13/chartex" xmlns:cx8="http://schemas.microsoft.com/office/drawing/2016/5/14/chartex" xmlns:mc="http://schemas.openxmlformats.org/markup-compatibility/2006" xmlns:aink="http://schemas.microsoft.com/office/drawing/2016/ink" xmlns:am3d="http://schemas.microsoft.com/office/drawing/2017/model3d" xmlns:o="urn:schemas-microsoft-com:office:office" xmlns:oel="http://schemas.microsoft.com/office/2019/extlst" xmlns:r="http://schemas.openxmlformats.org/officeDocument/2006/relationships" xmlns:m="http://schemas.openxmlformats.org/officeDocument/2006/math" xmlns:v="urn:schemas-microsoft-com:vml" xmlns:wp14="http://schemas.microsoft.com/office/word/2010/wordprocessingDrawing" xmlns:wp="http://schemas.openxmlformats.org/drawingml/2006/wordprocessingDrawing" xmlns:w10="urn:schemas-microsoft-com:office:word" xmlns:w="http://schemas.openxmlformats.org/wordprocessingml/2006/main" xmlns:w14="http://schemas.microsoft.com/office/word/2010/wordml" xmlns:w15="http://schemas.microsoft.com/office/word/2012/wordml" xmlns:w16cex="http://schemas.microsoft.com/office/word/2018/wordml/cex" xmlns:w16cid="http://schemas.microsoft.com/office/word/2016/wordml/cid" xmlns:w16="http://schemas.microsoft.com/office/word/2018/wordml" xmlns:w16du="http://schemas.microsoft.com/office/word/2023/wordml/word16du" xmlns:w16sdtdh="http://schemas.microsoft.com/office/word/2020/wordml/sdtdatahash" xmlns:w16sdtfl="http://schemas.microsoft.com/office/word/2024/wordml/sdtformatlock" xmlns:w16se="http://schemas.microsoft.com/office/word/2015/wordml/symex" xmlns:wpg="http://schemas.microsoft.com/office/word/2010/wordprocessingGroup" xmlns:wpi="http://schemas.microsoft.com/office/word/2010/wordprocessingInk" xmlns:wne="http://schemas.microsoft.com/office/word/2006/wordml" xmlns:wps="http://schemas.microsoft.com/office/word/2010/wordprocessingShape" mc:Ignorable="w14 w15 w16se w16cid w16 w16cex w16sdtdh w16sdtfl w16du wp14">
+  <w:p>
+    <w:pPr>
+      <w:pStyle w:val="af4"/>
+      <w:ind w:firstLine="360"/>
+    </w:pPr>
+  </w:p>
+</w:ftr>
+</file>
+
 <file path=word/footnotes.xml><?xml version="1.0" encoding="utf-8"?>
 <w:footnotes xmlns:wpc="http://schemas.microsoft.com/office/word/2010/wordprocessingCanvas" xmlns:cx="http://schemas.microsoft.com/office/drawing/2014/chartex" xmlns:cx1="http://schemas.microsoft.com/office/drawing/2015/9/8/chartex" xmlns:cx2="http://schemas.microsoft.com/office/drawing/2015/10/21/chartex" xmlns:cx3="http://schemas.microsoft.com/office/drawing/2016/5/9/chartex" xmlns:cx4="http://schemas.microsoft.com/office/drawing/2016/5/10/chartex" xmlns:cx5="http://schemas.microsoft.com/office/drawing/2016/5/11/chartex" xmlns:cx6="http://schemas.microsoft.com/office/drawing/2016/5/12/chartex" xmlns:cx7="http://schemas.microsoft.com/office/drawing/2016/5/13/chartex" xmlns:cx8="http://schemas.microsoft.com/office/drawing/2016/5/14/chartex" xmlns:mc="http://schemas.openxmlformats.org/markup-compatibility/2006" xmlns:aink="http://schemas.microsoft.com/office/drawing/2016/ink" xmlns:am3d="http://schemas.microsoft.com/office/drawing/2017/model3d" xmlns:o="urn:schemas-microsoft-com:office:office" xmlns:oel="http://schemas.microsoft.com/office/2019/extlst" xmlns:r="http://schemas.openxmlformats.org/officeDocument/2006/relationships" xmlns:m="http://schemas.openxmlformats.org/officeDocument/2006/math" xmlns:v="urn:schemas-microsoft-com:vml" xmlns:wp14="http://schemas.microsoft.com/office/word/2010/wordprocessingDrawing" xmlns:wp="http://schemas.openxmlformats.org/drawingml/2006/wordprocessingDrawing" xmlns:w10="urn:schemas-microsoft-com:office:word" xmlns:w="http://schemas.openxmlformats.org/wordprocessingml/2006/main" xmlns:w14="http://schemas.microsoft.com/office/word/2010/wordml" xmlns:w15="http://schemas.microsoft.com/office/word/2012/wordml" xmlns:w16cex="http://schemas.microsoft.com/office/word/2018/wordml/cex" xmlns:w16cid="http://schemas.microsoft.com/office/word/2016/wordml/cid" xmlns:w16="http://schemas.microsoft.com/office/word/2018/wordml" xmlns:w16du="http://schemas.microsoft.com/office/word/2023/wordml/word16du" xmlns:w16sdtdh="http://schemas.microsoft.com/office/word/2020/wordml/sdtdatahash" xmlns:w16sdtfl="http://schemas.microsoft.com/office/word/2024/wordml/sdtformatlock" xmlns:w16se="http://schemas.microsoft.com/office/word/2015/wordml/symex" xmlns:wpg="http://schemas.microsoft.com/office/word/2010/wordprocessingGroup" xmlns:wpi="http://schemas.microsoft.com/office/word/2010/wordprocessingInk" xmlns:wne="http://schemas.microsoft.com/office/word/2006/wordml" xmlns:wps="http://schemas.microsoft.com/office/word/2010/wordprocessingShape" mc:Ignorable="w14 w15 w16se w16cid w16 w16cex w16sdtdh w16sdtfl w16du wp14">
   <w:footnote w:type="separator" w:id="-1">
@@ -6683,6 +6783,39 @@
     </w:p>
   </w:footnote>
 </w:footnotes>
+</file>
+
+<file path=word/header1.xml><?xml version="1.0" encoding="utf-8"?>
+<w:hdr xmlns:wpc="http://schemas.microsoft.com/office/word/2010/wordprocessingCanvas" xmlns:cx="http://schemas.microsoft.com/office/drawing/2014/chartex" xmlns:cx1="http://schemas.microsoft.com/office/drawing/2015/9/8/chartex" xmlns:cx2="http://schemas.microsoft.com/office/drawing/2015/10/21/chartex" xmlns:cx3="http://schemas.microsoft.com/office/drawing/2016/5/9/chartex" xmlns:cx4="http://schemas.microsoft.com/office/drawing/2016/5/10/chartex" xmlns:cx5="http://schemas.microsoft.com/office/drawing/2016/5/11/chartex" xmlns:cx6="http://schemas.microsoft.com/office/drawing/2016/5/12/chartex" xmlns:cx7="http://schemas.microsoft.com/office/drawing/2016/5/13/chartex" xmlns:cx8="http://schemas.microsoft.com/office/drawing/2016/5/14/chartex" xmlns:mc="http://schemas.openxmlformats.org/markup-compatibility/2006" xmlns:aink="http://schemas.microsoft.com/office/drawing/2016/ink" xmlns:am3d="http://schemas.microsoft.com/office/drawing/2017/model3d" xmlns:o="urn:schemas-microsoft-com:office:office" xmlns:oel="http://schemas.microsoft.com/office/2019/extlst" xmlns:r="http://schemas.openxmlformats.org/officeDocument/2006/relationships" xmlns:m="http://schemas.openxmlformats.org/officeDocument/2006/math" xmlns:v="urn:schemas-microsoft-com:vml" xmlns:wp14="http://schemas.microsoft.com/office/word/2010/wordprocessingDrawing" xmlns:wp="http://schemas.openxmlformats.org/drawingml/2006/wordprocessingDrawing" xmlns:w10="urn:schemas-microsoft-com:office:word" xmlns:w="http://schemas.openxmlformats.org/wordprocessingml/2006/main" xmlns:w14="http://schemas.microsoft.com/office/word/2010/wordml" xmlns:w15="http://schemas.microsoft.com/office/word/2012/wordml" xmlns:w16cex="http://schemas.microsoft.com/office/word/2018/wordml/cex" xmlns:w16cid="http://schemas.microsoft.com/office/word/2016/wordml/cid" xmlns:w16="http://schemas.microsoft.com/office/word/2018/wordml" xmlns:w16du="http://schemas.microsoft.com/office/word/2023/wordml/word16du" xmlns:w16sdtdh="http://schemas.microsoft.com/office/word/2020/wordml/sdtdatahash" xmlns:w16sdtfl="http://schemas.microsoft.com/office/word/2024/wordml/sdtformatlock" xmlns:w16se="http://schemas.microsoft.com/office/word/2015/wordml/symex" xmlns:wpg="http://schemas.microsoft.com/office/word/2010/wordprocessingGroup" xmlns:wpi="http://schemas.microsoft.com/office/word/2010/wordprocessingInk" xmlns:wne="http://schemas.microsoft.com/office/word/2006/wordml" xmlns:wps="http://schemas.microsoft.com/office/word/2010/wordprocessingShape" mc:Ignorable="w14 w15 w16se w16cid w16 w16cex w16sdtdh w16sdtfl w16du wp14">
+  <w:p>
+    <w:pPr>
+      <w:pStyle w:val="af2"/>
+      <w:ind w:firstLine="360"/>
+    </w:pPr>
+  </w:p>
+</w:hdr>
+</file>
+
+<file path=word/header2.xml><?xml version="1.0" encoding="utf-8"?>
+<w:hdr xmlns:wpc="http://schemas.microsoft.com/office/word/2010/wordprocessingCanvas" xmlns:cx="http://schemas.microsoft.com/office/drawing/2014/chartex" xmlns:cx1="http://schemas.microsoft.com/office/drawing/2015/9/8/chartex" xmlns:cx2="http://schemas.microsoft.com/office/drawing/2015/10/21/chartex" xmlns:cx3="http://schemas.microsoft.com/office/drawing/2016/5/9/chartex" xmlns:cx4="http://schemas.microsoft.com/office/drawing/2016/5/10/chartex" xmlns:cx5="http://schemas.microsoft.com/office/drawing/2016/5/11/chartex" xmlns:cx6="http://schemas.microsoft.com/office/drawing/2016/5/12/chartex" xmlns:cx7="http://schemas.microsoft.com/office/drawing/2016/5/13/chartex" xmlns:cx8="http://schemas.microsoft.com/office/drawing/2016/5/14/chartex" xmlns:mc="http://schemas.openxmlformats.org/markup-compatibility/2006" xmlns:aink="http://schemas.microsoft.com/office/drawing/2016/ink" xmlns:am3d="http://schemas.microsoft.com/office/drawing/2017/model3d" xmlns:o="urn:schemas-microsoft-com:office:office" xmlns:oel="http://schemas.microsoft.com/office/2019/extlst" xmlns:r="http://schemas.openxmlformats.org/officeDocument/2006/relationships" xmlns:m="http://schemas.openxmlformats.org/officeDocument/2006/math" xmlns:v="urn:schemas-microsoft-com:vml" xmlns:wp14="http://schemas.microsoft.com/office/word/2010/wordprocessingDrawing" xmlns:wp="http://schemas.openxmlformats.org/drawingml/2006/wordprocessingDrawing" xmlns:w10="urn:schemas-microsoft-com:office:word" xmlns:w="http://schemas.openxmlformats.org/wordprocessingml/2006/main" xmlns:w14="http://schemas.microsoft.com/office/word/2010/wordml" xmlns:w15="http://schemas.microsoft.com/office/word/2012/wordml" xmlns:w16cex="http://schemas.microsoft.com/office/word/2018/wordml/cex" xmlns:w16cid="http://schemas.microsoft.com/office/word/2016/wordml/cid" xmlns:w16="http://schemas.microsoft.com/office/word/2018/wordml" xmlns:w16du="http://schemas.microsoft.com/office/word/2023/wordml/word16du" xmlns:w16sdtdh="http://schemas.microsoft.com/office/word/2020/wordml/sdtdatahash" xmlns:w16sdtfl="http://schemas.microsoft.com/office/word/2024/wordml/sdtformatlock" xmlns:w16se="http://schemas.microsoft.com/office/word/2015/wordml/symex" xmlns:wpg="http://schemas.microsoft.com/office/word/2010/wordprocessingGroup" xmlns:wpi="http://schemas.microsoft.com/office/word/2010/wordprocessingInk" xmlns:wne="http://schemas.microsoft.com/office/word/2006/wordml" xmlns:wps="http://schemas.microsoft.com/office/word/2010/wordprocessingShape" mc:Ignorable="w14 w15 w16se w16cid w16 w16cex w16sdtdh w16sdtfl w16du wp14">
+  <w:p>
+    <w:pPr>
+      <w:pStyle w:val="af2"/>
+      <w:ind w:firstLine="360"/>
+    </w:pPr>
+  </w:p>
+</w:hdr>
+</file>
+
+<file path=word/header3.xml><?xml version="1.0" encoding="utf-8"?>
+<w:hdr xmlns:wpc="http://schemas.microsoft.com/office/word/2010/wordprocessingCanvas" xmlns:cx="http://schemas.microsoft.com/office/drawing/2014/chartex" xmlns:cx1="http://schemas.microsoft.com/office/drawing/2015/9/8/chartex" xmlns:cx2="http://schemas.microsoft.com/office/drawing/2015/10/21/chartex" xmlns:cx3="http://schemas.microsoft.com/office/drawing/2016/5/9/chartex" xmlns:cx4="http://schemas.microsoft.com/office/drawing/2016/5/10/chartex" xmlns:cx5="http://schemas.microsoft.com/office/drawing/2016/5/11/chartex" xmlns:cx6="http://schemas.microsoft.com/office/drawing/2016/5/12/chartex" xmlns:cx7="http://schemas.microsoft.com/office/drawing/2016/5/13/chartex" xmlns:cx8="http://schemas.microsoft.com/office/drawing/2016/5/14/chartex" xmlns:mc="http://schemas.openxmlformats.org/markup-compatibility/2006" xmlns:aink="http://schemas.microsoft.com/office/drawing/2016/ink" xmlns:am3d="http://schemas.microsoft.com/office/drawing/2017/model3d" xmlns:o="urn:schemas-microsoft-com:office:office" xmlns:oel="http://schemas.microsoft.com/office/2019/extlst" xmlns:r="http://schemas.openxmlformats.org/officeDocument/2006/relationships" xmlns:m="http://schemas.openxmlformats.org/officeDocument/2006/math" xmlns:v="urn:schemas-microsoft-com:vml" xmlns:wp14="http://schemas.microsoft.com/office/word/2010/wordprocessingDrawing" xmlns:wp="http://schemas.openxmlformats.org/drawingml/2006/wordprocessingDrawing" xmlns:w10="urn:schemas-microsoft-com:office:word" xmlns:w="http://schemas.openxmlformats.org/wordprocessingml/2006/main" xmlns:w14="http://schemas.microsoft.com/office/word/2010/wordml" xmlns:w15="http://schemas.microsoft.com/office/word/2012/wordml" xmlns:w16cex="http://schemas.microsoft.com/office/word/2018/wordml/cex" xmlns:w16cid="http://schemas.microsoft.com/office/word/2016/wordml/cid" xmlns:w16="http://schemas.microsoft.com/office/word/2018/wordml" xmlns:w16du="http://schemas.microsoft.com/office/word/2023/wordml/word16du" xmlns:w16sdtdh="http://schemas.microsoft.com/office/word/2020/wordml/sdtdatahash" xmlns:w16sdtfl="http://schemas.microsoft.com/office/word/2024/wordml/sdtformatlock" xmlns:w16se="http://schemas.microsoft.com/office/word/2015/wordml/symex" xmlns:wpg="http://schemas.microsoft.com/office/word/2010/wordprocessingGroup" xmlns:wpi="http://schemas.microsoft.com/office/word/2010/wordprocessingInk" xmlns:wne="http://schemas.microsoft.com/office/word/2006/wordml" xmlns:wps="http://schemas.microsoft.com/office/word/2010/wordprocessingShape" mc:Ignorable="w14 w15 w16se w16cid w16 w16cex w16sdtdh w16sdtfl w16du wp14">
+  <w:p>
+    <w:pPr>
+      <w:pStyle w:val="af2"/>
+      <w:ind w:firstLine="360"/>
+    </w:pPr>
+  </w:p>
+</w:hdr>
 </file>
 
 <file path=word/numbering.xml><?xml version="1.0" encoding="utf-8"?>
@@ -10322,6 +10455,7 @@
   <w:style w:type="character" w:default="1" w:styleId="a4">
     <w:name w:val="Default Paragraph Font"/>
     <w:uiPriority w:val="1"/>
+    <w:semiHidden/>
     <w:unhideWhenUsed/>
   </w:style>
   <w:style w:type="table" w:default="1" w:styleId="a5">
@@ -11144,7 +11278,7 @@
     <w:unhideWhenUsed/>
     <w:rsid w:val="009E5624"/>
     <w:pPr>
-      <w:ind w:leftChars="200" w:hangingChars="200" w:hanging="200"/>
+      <w:ind w:leftChars="200" w:left="200" w:hangingChars="200" w:hanging="200"/>
     </w:pPr>
   </w:style>
   <w:style w:type="paragraph" w:customStyle="1" w:styleId="ng-star-inserted">

</xml_diff>